<commit_message>
update read me and rup report
</commit_message>
<xml_diff>
--- a/RUP REPORT.docx
+++ b/RUP REPORT.docx
@@ -125,7 +125,23 @@
           <w:bCs/>
           <w:lang w:val="el-GR"/>
         </w:rPr>
-        <w:t>1.1 Όραμα Έργου</w:t>
+        <w:t>1.1 Όραμα</w:t>
+      </w:r>
+      <w:r>
+        <w:rPr>
+          <w:b/>
+          <w:bCs/>
+          <w:lang w:val="el-GR"/>
+        </w:rPr>
+        <w:t xml:space="preserve"> </w:t>
+      </w:r>
+      <w:r>
+        <w:rPr>
+          <w:b/>
+          <w:bCs/>
+          <w:lang w:val="el-GR"/>
+        </w:rPr>
+        <w:t xml:space="preserve"> Έργου</w:t>
       </w:r>
     </w:p>
     <w:p>
@@ -3027,7 +3043,7 @@
     <w:p>
       <w:r>
         <w:pict w14:anchorId="6F6FF613">
-          <v:rect id="_x0000_i1047" style="width:0;height:1.5pt" o:hralign="center" o:hrstd="t" o:hr="t" fillcolor="#a0a0a0" stroked="f"/>
+          <v:rect id="_x0000_i1037" style="width:0;height:1.5pt" o:hralign="center" o:hrstd="t" o:hr="t" fillcolor="#a0a0a0" stroked="f"/>
         </w:pict>
       </w:r>
     </w:p>

</xml_diff>